<commit_message>
Delivery system: roadmap resource, ONB 09 mentions Progress Tracker, ONB 07 week-20 label
Co-Authored-By: Claude Opus 5.5 <noreply@anthropic.com>
Claude-Session: https://claude.ai/code/session_01PSmnUj1LvutfXzpzQBGsxa
</commit_message>
<xml_diff>
--- a/onboarding/prompters/09 — Tu espacio personal AT WORK · PROMPTER LISTO.docx
+++ b/onboarding/prompters/09 — Tu espacio personal AT WORK · PROMPTER LISTO.docx
@@ -135,6 +135,11 @@
     <w:p>
       <w:r>
         <w:t>Aunque después compartas un win, una duda o algo del reporte por WhatsApp, el Weekly Report completo queda guardado acá.</w:t>
+      </w:r>
+    </w:p>
+    <w:p>
+      <w:r>
+        <w:t>Y acá también vas a encontrar tu Progress Tracker. El Weekly Report es tu reflexión de cada semana; el Progress Tracker es la foto del recorrido completo: en qué etapa estás, qué skill estás entrenando, qué evidencia fuiste acumulando, qué hitos ya lograste y cuál es el próximo. Lo vamos a ir actualizando juntas, en general al cierre de nuestras sesiones.</w:t>
       </w:r>
     </w:p>
     <w:p>

</xml_diff>

<commit_message>
Drop Progress Tracker (Weekly Report covers it); revert ONB 09 mention
Co-Authored-By: Claude Opus 5.5 <noreply@anthropic.com>
Claude-Session: https://claude.ai/code/session_01PSmnUj1LvutfXzpzQBGsxa
</commit_message>
<xml_diff>
--- a/onboarding/prompters/09 — Tu espacio personal AT WORK · PROMPTER LISTO.docx
+++ b/onboarding/prompters/09 — Tu espacio personal AT WORK · PROMPTER LISTO.docx
@@ -135,11 +135,6 @@
     <w:p>
       <w:r>
         <w:t>Aunque después compartas un win, una duda o algo del reporte por WhatsApp, el Weekly Report completo queda guardado acá.</w:t>
-      </w:r>
-    </w:p>
-    <w:p>
-      <w:r>
-        <w:t>Y acá también vas a encontrar tu Progress Tracker. El Weekly Report es tu reflexión de cada semana; el Progress Tracker es la foto del recorrido completo: en qué etapa estás, qué skill estás entrenando, qué evidencia fuiste acumulando, qué hitos ya lograste y cuál es el próximo. Lo vamos a ir actualizando juntas, en general al cierre de nuestras sesiones.</w:t>
       </w:r>
     </w:p>
     <w:p>

</xml_diff>